<commit_message>
V.1.3 - Full version
</commit_message>
<xml_diff>
--- a/dist/CODS/_internal/templates/รายงานกระบวนพิจารณา.docx
+++ b/dist/CODS/_internal/templates/รายงานกระบวนพิจารณา.docx
@@ -1779,23 +1779,6 @@
           <w:rFonts w:ascii="TH SarabunIT๙" w:hAnsi="TH SarabunIT๙" w:cs="TH SarabunIT๙"/>
           <w:sz w:val="34"/>
           <w:szCs w:val="34"/>
-          <w:cs/>
-        </w:rPr>
-        <w:t>นัด</w:t>
-      </w:r>
-      <w:r>
-        <w:rPr>
-          <w:rFonts w:ascii="TH SarabunIT๙" w:hAnsi="TH SarabunIT๙" w:cs="TH SarabunIT๙"/>
-          <w:sz w:val="34"/>
-          <w:szCs w:val="34"/>
-        </w:rPr>
-        <w:t xml:space="preserve"> </w:t>
-      </w:r>
-      <w:r>
-        <w:rPr>
-          <w:rFonts w:ascii="TH SarabunIT๙" w:hAnsi="TH SarabunIT๙" w:cs="TH SarabunIT๙"/>
-          <w:sz w:val="34"/>
-          <w:szCs w:val="34"/>
         </w:rPr>
         <w:t>{{</w:t>
       </w:r>
@@ -2070,13 +2053,13 @@
         <w:spacing w:before="0pt" w:beforeAutospacing="0" w:afterAutospacing="0"/>
         <w:jc w:val="center"/>
         <w:rPr>
-          <w:rFonts w:ascii="TH SarabunIT๙" w:hAnsi="TH SarabunIT๙" w:cs="TH SarabunIT๙" w:hint="cs"/>
+          <w:rFonts w:ascii="TH SarabunIT๙" w:hAnsi="TH SarabunIT๙" w:cs="TH SarabunIT๙"/>
           <w:sz w:val="34"/>
           <w:szCs w:val="34"/>
         </w:rPr>
       </w:pPr>
-      <w:bookmarkStart w:id="1" w:name="_Hlk240276533"/>
-      <w:bookmarkStart w:id="2" w:name="_Hlk144712025"/>
+      <w:bookmarkStart w:id="1" w:name="_Hlk144712025"/>
+      <w:bookmarkStart w:id="2" w:name="_Hlk240276533"/>
       <w:r>
         <w:rPr>
           <w:rFonts w:ascii="TH SarabunIT๙" w:hAnsi="TH SarabunIT๙" w:cs="TH SarabunIT๙"/>
@@ -2132,7 +2115,7 @@
         </w:rPr>
         <w:t>)</w:t>
       </w:r>
-      <w:bookmarkEnd w:id="2"/>
+      <w:bookmarkEnd w:id="1"/>
       <w:r>
         <w:rPr>
           <w:rFonts w:ascii="TH SarabunIT๙" w:hAnsi="TH SarabunIT๙" w:cs="TH SarabunIT๙"/>
@@ -2233,7 +2216,7 @@
         <w:t>บันทึก/อ่าน</w:t>
       </w:r>
     </w:p>
-    <w:bookmarkEnd w:id="1"/>
+    <w:bookmarkEnd w:id="2"/>
     <w:p>
       <w:pPr>
         <w:pStyle w:val="NormalWeb"/>

</xml_diff>